<commit_message>
Actualizada la documentación del proyecto en formato Word
</commit_message>
<xml_diff>
--- a/Documentación - Proyecto HE_clas - Entorno virtual, instalación de librerias y github.docx
+++ b/Documentación - Proyecto HE_clas - Entorno virtual, instalación de librerias y github.docx
@@ -5174,8 +5174,761 @@
           <w:lang w:eastAsia="es-AR"/>
           <w14:ligatures w14:val="none"/>
         </w:rPr>
-        <w:t>Empuja el archivo a la nube:</w:t>
-      </w:r>
+        <w:t>Empuja el archivo a la nube</w:t>
+      </w:r>
+    </w:p>
+    <w:p>
+      <w:pPr>
+        <w:spacing w:before="120" w:after="120" w:line="240" w:lineRule="auto"/>
+        <w:rPr>
+          <w:rFonts w:eastAsia="Times New Roman" w:cs="Times New Roman"/>
+          <w:kern w:val="0"/>
+          <w:lang w:eastAsia="es-AR"/>
+          <w14:ligatures w14:val="none"/>
+        </w:rPr>
+      </w:pPr>
+    </w:p>
+    <w:p>
+      <w:pPr>
+        <w:spacing w:before="120" w:after="120" w:line="240" w:lineRule="auto"/>
+        <w:rPr>
+          <w:rFonts w:eastAsia="Times New Roman" w:cs="Times New Roman"/>
+          <w:kern w:val="0"/>
+          <w:lang w:eastAsia="es-AR"/>
+          <w14:ligatures w14:val="none"/>
+        </w:rPr>
+      </w:pPr>
+      <w:r>
+        <w:rPr>
+          <w:rFonts w:ascii="Segoe UI Emoji" w:eastAsia="Times New Roman" w:hAnsi="Segoe UI Emoji" w:cs="Segoe UI Emoji"/>
+          <w:kern w:val="0"/>
+          <w:lang w:eastAsia="es-AR"/>
+          <w14:ligatures w14:val="none"/>
+        </w:rPr>
+        <w:t>💻</w:t>
+      </w:r>
+      <w:r>
+        <w:rPr>
+          <w:rFonts w:eastAsia="Times New Roman" w:cs="Times New Roman"/>
+          <w:kern w:val="0"/>
+          <w:lang w:eastAsia="es-AR"/>
+          <w14:ligatures w14:val="none"/>
+        </w:rPr>
+        <w:t xml:space="preserve"> </w:t>
+      </w:r>
+      <w:r>
+        <w:rPr>
+          <w:rFonts w:eastAsia="Times New Roman" w:cs="Times New Roman"/>
+          <w:b/>
+          <w:bCs/>
+          <w:kern w:val="0"/>
+          <w:lang w:eastAsia="es-AR"/>
+          <w14:ligatures w14:val="none"/>
+        </w:rPr>
+        <w:t>7.</w:t>
+      </w:r>
+      <w:r>
+        <w:rPr>
+          <w:rFonts w:eastAsia="Times New Roman" w:cs="Times New Roman"/>
+          <w:kern w:val="0"/>
+          <w:lang w:eastAsia="es-AR"/>
+          <w14:ligatures w14:val="none"/>
+        </w:rPr>
+        <w:t xml:space="preserve"> </w:t>
+      </w:r>
+      <w:r>
+        <w:rPr>
+          <w:rFonts w:eastAsia="Times New Roman" w:cs="Times New Roman"/>
+          <w:b/>
+          <w:bCs/>
+          <w:kern w:val="0"/>
+          <w:lang w:eastAsia="es-AR"/>
+          <w14:ligatures w14:val="none"/>
+        </w:rPr>
+        <w:t>Sincronización</w:t>
+      </w:r>
+      <w:r>
+        <w:rPr>
+          <w:rFonts w:eastAsia="Times New Roman" w:cs="Times New Roman"/>
+          <w:kern w:val="0"/>
+          <w:lang w:eastAsia="es-AR"/>
+          <w14:ligatures w14:val="none"/>
+        </w:rPr>
+        <w:t>.</w:t>
+      </w:r>
+      <w:r>
+        <w:rPr>
+          <w:rFonts w:eastAsia="Times New Roman" w:cs="Times New Roman"/>
+          <w:kern w:val="0"/>
+          <w:lang w:eastAsia="es-AR"/>
+          <w14:ligatures w14:val="none"/>
+        </w:rPr>
+        <w:t xml:space="preserve"> </w:t>
+      </w:r>
+      <w:r>
+        <w:rPr>
+          <w:rFonts w:eastAsia="Times New Roman" w:cs="Times New Roman"/>
+          <w:kern w:val="0"/>
+          <w:lang w:eastAsia="es-AR"/>
+          <w14:ligatures w14:val="none"/>
+        </w:rPr>
+        <w:t>Si en la "Computadora B" hiciste cambios y los subiste (</w:t>
+      </w:r>
+      <w:proofErr w:type="spellStart"/>
+      <w:r>
+        <w:rPr>
+          <w:rFonts w:eastAsia="Times New Roman" w:cs="Times New Roman"/>
+          <w:kern w:val="0"/>
+          <w:lang w:eastAsia="es-AR"/>
+          <w14:ligatures w14:val="none"/>
+        </w:rPr>
+        <w:t>Push</w:t>
+      </w:r>
+      <w:proofErr w:type="spellEnd"/>
+      <w:r>
+        <w:rPr>
+          <w:rFonts w:eastAsia="Times New Roman" w:cs="Times New Roman"/>
+          <w:kern w:val="0"/>
+          <w:lang w:eastAsia="es-AR"/>
+          <w14:ligatures w14:val="none"/>
+        </w:rPr>
+        <w:t>), ahora la "Computadora A" está desactualizada.</w:t>
+      </w:r>
+    </w:p>
+    <w:p>
+      <w:pPr>
+        <w:spacing w:before="120" w:after="120" w:line="240" w:lineRule="auto"/>
+        <w:rPr>
+          <w:rFonts w:eastAsia="Times New Roman" w:cs="Times New Roman"/>
+          <w:kern w:val="0"/>
+          <w:lang w:eastAsia="es-AR"/>
+          <w14:ligatures w14:val="none"/>
+        </w:rPr>
+      </w:pPr>
+      <w:r>
+        <w:rPr>
+          <w:rFonts w:eastAsia="Times New Roman" w:cs="Times New Roman"/>
+          <w:kern w:val="0"/>
+          <w:lang w:eastAsia="es-AR"/>
+          <w14:ligatures w14:val="none"/>
+        </w:rPr>
+        <w:t xml:space="preserve">Abre </w:t>
+      </w:r>
+      <w:proofErr w:type="spellStart"/>
+      <w:r>
+        <w:rPr>
+          <w:rFonts w:eastAsia="Times New Roman" w:cs="Times New Roman"/>
+          <w:kern w:val="0"/>
+          <w:lang w:eastAsia="es-AR"/>
+          <w14:ligatures w14:val="none"/>
+        </w:rPr>
+        <w:t>RStudio</w:t>
+      </w:r>
+      <w:proofErr w:type="spellEnd"/>
+      <w:r>
+        <w:rPr>
+          <w:rFonts w:eastAsia="Times New Roman" w:cs="Times New Roman"/>
+          <w:kern w:val="0"/>
+          <w:lang w:eastAsia="es-AR"/>
+          <w14:ligatures w14:val="none"/>
+        </w:rPr>
+        <w:t xml:space="preserve"> en la computadora donde quieres recibir los cambios y asegúrate de que el proyecto </w:t>
+      </w:r>
+      <w:proofErr w:type="spellStart"/>
+      <w:r>
+        <w:rPr>
+          <w:rFonts w:eastAsia="Times New Roman" w:cs="Times New Roman"/>
+          <w:kern w:val="0"/>
+          <w:lang w:eastAsia="es-AR"/>
+          <w14:ligatures w14:val="none"/>
+        </w:rPr>
+        <w:t>HE_clas</w:t>
+      </w:r>
+      <w:proofErr w:type="spellEnd"/>
+      <w:r>
+        <w:rPr>
+          <w:rFonts w:eastAsia="Times New Roman" w:cs="Times New Roman"/>
+          <w:kern w:val="0"/>
+          <w:lang w:eastAsia="es-AR"/>
+          <w14:ligatures w14:val="none"/>
+        </w:rPr>
+        <w:t xml:space="preserve"> esté activo.</w:t>
+      </w:r>
+    </w:p>
+    <w:p>
+      <w:pPr>
+        <w:spacing w:before="120" w:after="120" w:line="240" w:lineRule="auto"/>
+        <w:rPr>
+          <w:rFonts w:eastAsia="Times New Roman" w:cs="Times New Roman"/>
+          <w:kern w:val="0"/>
+          <w:lang w:eastAsia="es-AR"/>
+          <w14:ligatures w14:val="none"/>
+        </w:rPr>
+      </w:pPr>
+      <w:r>
+        <w:rPr>
+          <w:rFonts w:eastAsia="Times New Roman" w:cs="Times New Roman"/>
+          <w:kern w:val="0"/>
+          <w:lang w:eastAsia="es-AR"/>
+          <w14:ligatures w14:val="none"/>
+        </w:rPr>
+        <w:t xml:space="preserve">Ve a la </w:t>
+      </w:r>
+      <w:r>
+        <w:rPr>
+          <w:rFonts w:eastAsia="Times New Roman" w:cs="Times New Roman"/>
+          <w:b/>
+          <w:bCs/>
+          <w:kern w:val="0"/>
+          <w:lang w:eastAsia="es-AR"/>
+          <w14:ligatures w14:val="none"/>
+        </w:rPr>
+        <w:t>Terminal</w:t>
+      </w:r>
+      <w:r>
+        <w:rPr>
+          <w:rFonts w:eastAsia="Times New Roman" w:cs="Times New Roman"/>
+          <w:kern w:val="0"/>
+          <w:lang w:eastAsia="es-AR"/>
+          <w14:ligatures w14:val="none"/>
+        </w:rPr>
+        <w:t xml:space="preserve"> de </w:t>
+      </w:r>
+      <w:proofErr w:type="spellStart"/>
+      <w:r>
+        <w:rPr>
+          <w:rFonts w:eastAsia="Times New Roman" w:cs="Times New Roman"/>
+          <w:kern w:val="0"/>
+          <w:lang w:eastAsia="es-AR"/>
+          <w14:ligatures w14:val="none"/>
+        </w:rPr>
+        <w:t>RStudio</w:t>
+      </w:r>
+      <w:proofErr w:type="spellEnd"/>
+      <w:r>
+        <w:rPr>
+          <w:rFonts w:eastAsia="Times New Roman" w:cs="Times New Roman"/>
+          <w:kern w:val="0"/>
+          <w:lang w:eastAsia="es-AR"/>
+          <w14:ligatures w14:val="none"/>
+        </w:rPr>
+        <w:t>. Para "traer" lo último que hay en la nube hacia tu computadora, escribe:</w:t>
+      </w:r>
+    </w:p>
+    <w:p>
+      <w:pPr>
+        <w:spacing w:before="120" w:after="120" w:line="240" w:lineRule="auto"/>
+        <w:rPr>
+          <w:rFonts w:ascii="Courier New" w:eastAsia="Times New Roman" w:hAnsi="Courier New" w:cs="Courier New"/>
+          <w:kern w:val="0"/>
+          <w:lang w:eastAsia="es-AR"/>
+          <w14:ligatures w14:val="none"/>
+        </w:rPr>
+      </w:pPr>
+      <w:proofErr w:type="spellStart"/>
+      <w:r>
+        <w:rPr>
+          <w:rFonts w:ascii="Courier New" w:eastAsia="Times New Roman" w:hAnsi="Courier New" w:cs="Courier New"/>
+          <w:kern w:val="0"/>
+          <w:lang w:eastAsia="es-AR"/>
+          <w14:ligatures w14:val="none"/>
+        </w:rPr>
+        <w:t>git</w:t>
+      </w:r>
+      <w:proofErr w:type="spellEnd"/>
+      <w:r>
+        <w:rPr>
+          <w:rFonts w:ascii="Courier New" w:eastAsia="Times New Roman" w:hAnsi="Courier New" w:cs="Courier New"/>
+          <w:kern w:val="0"/>
+          <w:lang w:eastAsia="es-AR"/>
+          <w14:ligatures w14:val="none"/>
+        </w:rPr>
+        <w:t xml:space="preserve"> </w:t>
+      </w:r>
+      <w:proofErr w:type="spellStart"/>
+      <w:r>
+        <w:rPr>
+          <w:rFonts w:ascii="Courier New" w:eastAsia="Times New Roman" w:hAnsi="Courier New" w:cs="Courier New"/>
+          <w:kern w:val="0"/>
+          <w:lang w:eastAsia="es-AR"/>
+          <w14:ligatures w14:val="none"/>
+        </w:rPr>
+        <w:t>pull</w:t>
+      </w:r>
+      <w:proofErr w:type="spellEnd"/>
+      <w:r>
+        <w:rPr>
+          <w:rFonts w:ascii="Courier New" w:eastAsia="Times New Roman" w:hAnsi="Courier New" w:cs="Courier New"/>
+          <w:kern w:val="0"/>
+          <w:lang w:eastAsia="es-AR"/>
+          <w14:ligatures w14:val="none"/>
+        </w:rPr>
+        <w:t xml:space="preserve"> </w:t>
+      </w:r>
+      <w:proofErr w:type="spellStart"/>
+      <w:r>
+        <w:rPr>
+          <w:rFonts w:ascii="Courier New" w:eastAsia="Times New Roman" w:hAnsi="Courier New" w:cs="Courier New"/>
+          <w:kern w:val="0"/>
+          <w:lang w:eastAsia="es-AR"/>
+          <w14:ligatures w14:val="none"/>
+        </w:rPr>
+        <w:t>origin</w:t>
+      </w:r>
+      <w:proofErr w:type="spellEnd"/>
+      <w:r>
+        <w:rPr>
+          <w:rFonts w:ascii="Courier New" w:eastAsia="Times New Roman" w:hAnsi="Courier New" w:cs="Courier New"/>
+          <w:kern w:val="0"/>
+          <w:lang w:eastAsia="es-AR"/>
+          <w14:ligatures w14:val="none"/>
+        </w:rPr>
+        <w:t xml:space="preserve"> </w:t>
+      </w:r>
+      <w:proofErr w:type="spellStart"/>
+      <w:r>
+        <w:rPr>
+          <w:rFonts w:ascii="Courier New" w:eastAsia="Times New Roman" w:hAnsi="Courier New" w:cs="Courier New"/>
+          <w:kern w:val="0"/>
+          <w:lang w:eastAsia="es-AR"/>
+          <w14:ligatures w14:val="none"/>
+        </w:rPr>
+        <w:t>main</w:t>
+      </w:r>
+      <w:proofErr w:type="spellEnd"/>
+    </w:p>
+    <w:p>
+      <w:pPr>
+        <w:spacing w:before="120" w:after="120" w:line="240" w:lineRule="auto"/>
+        <w:rPr>
+          <w:rFonts w:eastAsia="Times New Roman" w:cs="Times New Roman"/>
+          <w:kern w:val="0"/>
+          <w:lang w:eastAsia="es-AR"/>
+          <w14:ligatures w14:val="none"/>
+        </w:rPr>
+      </w:pPr>
+      <w:r>
+        <w:rPr>
+          <w:rFonts w:eastAsia="Times New Roman" w:cs="Times New Roman"/>
+          <w:b/>
+          <w:bCs/>
+          <w:kern w:val="0"/>
+          <w:lang w:eastAsia="es-AR"/>
+          <w14:ligatures w14:val="none"/>
+        </w:rPr>
+        <w:t>¿Qué hace esto?</w:t>
+      </w:r>
+    </w:p>
+    <w:p>
+      <w:pPr>
+        <w:numPr>
+          <w:ilvl w:val="0"/>
+          <w:numId w:val="14"/>
+        </w:numPr>
+        <w:spacing w:before="120" w:after="120" w:line="240" w:lineRule="auto"/>
+        <w:rPr>
+          <w:rFonts w:eastAsia="Times New Roman" w:cs="Times New Roman"/>
+          <w:kern w:val="0"/>
+          <w:lang w:eastAsia="es-AR"/>
+          <w14:ligatures w14:val="none"/>
+        </w:rPr>
+      </w:pPr>
+      <w:r>
+        <w:rPr>
+          <w:rFonts w:eastAsia="Times New Roman" w:cs="Times New Roman"/>
+          <w:kern w:val="0"/>
+          <w:lang w:eastAsia="es-AR"/>
+          <w14:ligatures w14:val="none"/>
+        </w:rPr>
+        <w:t>Mira en GitHub si hay algo nuevo.</w:t>
+      </w:r>
+    </w:p>
+    <w:p>
+      <w:pPr>
+        <w:numPr>
+          <w:ilvl w:val="0"/>
+          <w:numId w:val="14"/>
+        </w:numPr>
+        <w:spacing w:before="120" w:after="120" w:line="240" w:lineRule="auto"/>
+        <w:rPr>
+          <w:rFonts w:eastAsia="Times New Roman" w:cs="Times New Roman"/>
+          <w:kern w:val="0"/>
+          <w:lang w:eastAsia="es-AR"/>
+          <w14:ligatures w14:val="none"/>
+        </w:rPr>
+      </w:pPr>
+      <w:r>
+        <w:rPr>
+          <w:rFonts w:eastAsia="Times New Roman" w:cs="Times New Roman"/>
+          <w:kern w:val="0"/>
+          <w:lang w:eastAsia="es-AR"/>
+          <w14:ligatures w14:val="none"/>
+        </w:rPr>
+        <w:t>Lo descarga automáticamente.</w:t>
+      </w:r>
+    </w:p>
+    <w:p>
+      <w:pPr>
+        <w:numPr>
+          <w:ilvl w:val="0"/>
+          <w:numId w:val="14"/>
+        </w:numPr>
+        <w:spacing w:before="120" w:after="120" w:line="240" w:lineRule="auto"/>
+        <w:rPr>
+          <w:rFonts w:eastAsia="Times New Roman" w:cs="Times New Roman"/>
+          <w:kern w:val="0"/>
+          <w:lang w:eastAsia="es-AR"/>
+          <w14:ligatures w14:val="none"/>
+        </w:rPr>
+      </w:pPr>
+      <w:r>
+        <w:rPr>
+          <w:rFonts w:eastAsia="Times New Roman" w:cs="Times New Roman"/>
+          <w:kern w:val="0"/>
+          <w:lang w:eastAsia="es-AR"/>
+          <w14:ligatures w14:val="none"/>
+        </w:rPr>
+        <w:t>"Pega" los cambios en tus archivos locales.</w:t>
+      </w:r>
+    </w:p>
+    <w:p>
+      <w:pPr>
+        <w:numPr>
+          <w:ilvl w:val="0"/>
+          <w:numId w:val="14"/>
+        </w:numPr>
+        <w:spacing w:before="120" w:after="120" w:line="240" w:lineRule="auto"/>
+        <w:rPr>
+          <w:rFonts w:eastAsia="Times New Roman" w:cs="Times New Roman"/>
+          <w:kern w:val="0"/>
+          <w:lang w:eastAsia="es-AR"/>
+          <w14:ligatures w14:val="none"/>
+        </w:rPr>
+      </w:pPr>
+      <w:r>
+        <w:rPr>
+          <w:rFonts w:eastAsia="Times New Roman" w:cs="Times New Roman"/>
+          <w:kern w:val="0"/>
+          <w:lang w:eastAsia="es-AR"/>
+          <w14:ligatures w14:val="none"/>
+        </w:rPr>
+        <w:t>Si agregaste ese archivo .</w:t>
+      </w:r>
+      <w:proofErr w:type="spellStart"/>
+      <w:r>
+        <w:rPr>
+          <w:rFonts w:eastAsia="Times New Roman" w:cs="Times New Roman"/>
+          <w:kern w:val="0"/>
+          <w:lang w:eastAsia="es-AR"/>
+          <w14:ligatures w14:val="none"/>
+        </w:rPr>
+        <w:t>doc</w:t>
+      </w:r>
+      <w:proofErr w:type="spellEnd"/>
+      <w:r>
+        <w:rPr>
+          <w:rFonts w:eastAsia="Times New Roman" w:cs="Times New Roman"/>
+          <w:kern w:val="0"/>
+          <w:lang w:eastAsia="es-AR"/>
+          <w14:ligatures w14:val="none"/>
+        </w:rPr>
+        <w:t xml:space="preserve"> o modificaste un script en la otra PC, aparecerán mágicamente en tu carpeta ahora.</w:t>
+      </w:r>
+    </w:p>
+    <w:p>
+      <w:pPr>
+        <w:spacing w:before="120" w:after="120" w:line="240" w:lineRule="auto"/>
+        <w:rPr>
+          <w:rFonts w:eastAsia="Times New Roman" w:cs="Times New Roman"/>
+          <w:kern w:val="0"/>
+          <w:lang w:eastAsia="es-AR"/>
+          <w14:ligatures w14:val="none"/>
+        </w:rPr>
+      </w:pPr>
+    </w:p>
+    <w:p>
+      <w:pPr>
+        <w:spacing w:before="120" w:after="120" w:line="240" w:lineRule="auto"/>
+        <w:rPr>
+          <w:rFonts w:eastAsia="Times New Roman" w:cs="Times New Roman"/>
+          <w:b/>
+          <w:bCs/>
+          <w:kern w:val="0"/>
+          <w:lang w:eastAsia="es-AR"/>
+          <w14:ligatures w14:val="none"/>
+        </w:rPr>
+      </w:pPr>
+      <w:proofErr w:type="spellStart"/>
+      <w:r>
+        <w:rPr>
+          <w:rFonts w:eastAsia="Times New Roman" w:cs="Times New Roman"/>
+          <w:b/>
+          <w:bCs/>
+          <w:kern w:val="0"/>
+          <w:lang w:eastAsia="es-AR"/>
+          <w14:ligatures w14:val="none"/>
+        </w:rPr>
+        <w:t>Sincronizacion</w:t>
+      </w:r>
+      <w:proofErr w:type="spellEnd"/>
+      <w:r>
+        <w:rPr>
+          <w:rFonts w:eastAsia="Times New Roman" w:cs="Times New Roman"/>
+          <w:b/>
+          <w:bCs/>
+          <w:kern w:val="0"/>
+          <w:lang w:eastAsia="es-AR"/>
+          <w14:ligatures w14:val="none"/>
+        </w:rPr>
+        <w:t xml:space="preserve"> de librerías:</w:t>
+      </w:r>
+    </w:p>
+    <w:p>
+      <w:pPr>
+        <w:spacing w:before="120" w:after="120" w:line="240" w:lineRule="auto"/>
+        <w:rPr>
+          <w:rFonts w:eastAsia="Times New Roman" w:cs="Times New Roman"/>
+          <w:kern w:val="0"/>
+          <w:lang w:eastAsia="es-AR"/>
+          <w14:ligatures w14:val="none"/>
+        </w:rPr>
+      </w:pPr>
+      <w:r>
+        <w:rPr>
+          <w:rFonts w:eastAsia="Times New Roman" w:cs="Times New Roman"/>
+          <w:kern w:val="0"/>
+          <w:lang w:eastAsia="es-AR"/>
+          <w14:ligatures w14:val="none"/>
+        </w:rPr>
+        <w:t xml:space="preserve">Si en la otra computadora instalaste un paquete nuevo o actualizaste una versión, el archivo </w:t>
+      </w:r>
+      <w:proofErr w:type="spellStart"/>
+      <w:proofErr w:type="gramStart"/>
+      <w:r>
+        <w:rPr>
+          <w:rFonts w:eastAsia="Times New Roman" w:cs="Times New Roman"/>
+          <w:kern w:val="0"/>
+          <w:lang w:eastAsia="es-AR"/>
+          <w14:ligatures w14:val="none"/>
+        </w:rPr>
+        <w:t>renv.lock</w:t>
+      </w:r>
+      <w:proofErr w:type="spellEnd"/>
+      <w:proofErr w:type="gramEnd"/>
+      <w:r>
+        <w:rPr>
+          <w:rFonts w:eastAsia="Times New Roman" w:cs="Times New Roman"/>
+          <w:kern w:val="0"/>
+          <w:lang w:eastAsia="es-AR"/>
+          <w14:ligatures w14:val="none"/>
+        </w:rPr>
+        <w:t xml:space="preserve"> habrá cambiado. Después de hacer el </w:t>
+      </w:r>
+      <w:proofErr w:type="spellStart"/>
+      <w:r>
+        <w:rPr>
+          <w:rFonts w:eastAsia="Times New Roman" w:cs="Times New Roman"/>
+          <w:kern w:val="0"/>
+          <w:lang w:eastAsia="es-AR"/>
+          <w14:ligatures w14:val="none"/>
+        </w:rPr>
+        <w:t>git</w:t>
+      </w:r>
+      <w:proofErr w:type="spellEnd"/>
+      <w:r>
+        <w:rPr>
+          <w:rFonts w:eastAsia="Times New Roman" w:cs="Times New Roman"/>
+          <w:kern w:val="0"/>
+          <w:lang w:eastAsia="es-AR"/>
+          <w14:ligatures w14:val="none"/>
+        </w:rPr>
+        <w:t xml:space="preserve"> </w:t>
+      </w:r>
+      <w:proofErr w:type="spellStart"/>
+      <w:r>
+        <w:rPr>
+          <w:rFonts w:eastAsia="Times New Roman" w:cs="Times New Roman"/>
+          <w:kern w:val="0"/>
+          <w:lang w:eastAsia="es-AR"/>
+          <w14:ligatures w14:val="none"/>
+        </w:rPr>
+        <w:t>pull</w:t>
+      </w:r>
+      <w:proofErr w:type="spellEnd"/>
+      <w:r>
+        <w:rPr>
+          <w:rFonts w:eastAsia="Times New Roman" w:cs="Times New Roman"/>
+          <w:kern w:val="0"/>
+          <w:lang w:eastAsia="es-AR"/>
+          <w14:ligatures w14:val="none"/>
+        </w:rPr>
+        <w:t xml:space="preserve">, es posible que </w:t>
+      </w:r>
+      <w:proofErr w:type="spellStart"/>
+      <w:r>
+        <w:rPr>
+          <w:rFonts w:eastAsia="Times New Roman" w:cs="Times New Roman"/>
+          <w:kern w:val="0"/>
+          <w:lang w:eastAsia="es-AR"/>
+          <w14:ligatures w14:val="none"/>
+        </w:rPr>
+        <w:t>RStudio</w:t>
+      </w:r>
+      <w:proofErr w:type="spellEnd"/>
+      <w:r>
+        <w:rPr>
+          <w:rFonts w:eastAsia="Times New Roman" w:cs="Times New Roman"/>
+          <w:kern w:val="0"/>
+          <w:lang w:eastAsia="es-AR"/>
+          <w14:ligatures w14:val="none"/>
+        </w:rPr>
+        <w:t xml:space="preserve"> te muestre un mensaje diciendo que el proyecto está fuera de sincronía.</w:t>
+      </w:r>
+    </w:p>
+    <w:p>
+      <w:pPr>
+        <w:spacing w:before="120" w:after="120" w:line="240" w:lineRule="auto"/>
+        <w:rPr>
+          <w:rFonts w:eastAsia="Times New Roman" w:cs="Times New Roman"/>
+          <w:kern w:val="0"/>
+          <w:lang w:eastAsia="es-AR"/>
+          <w14:ligatures w14:val="none"/>
+        </w:rPr>
+      </w:pPr>
+      <w:r>
+        <w:rPr>
+          <w:rFonts w:eastAsia="Times New Roman" w:cs="Times New Roman"/>
+          <w:kern w:val="0"/>
+          <w:lang w:eastAsia="es-AR"/>
+          <w14:ligatures w14:val="none"/>
+        </w:rPr>
+        <w:t xml:space="preserve">Para igualar las librerías, corre en la </w:t>
+      </w:r>
+      <w:r>
+        <w:rPr>
+          <w:rFonts w:eastAsia="Times New Roman" w:cs="Times New Roman"/>
+          <w:b/>
+          <w:bCs/>
+          <w:kern w:val="0"/>
+          <w:lang w:eastAsia="es-AR"/>
+          <w14:ligatures w14:val="none"/>
+        </w:rPr>
+        <w:t>consola</w:t>
+      </w:r>
+      <w:r>
+        <w:rPr>
+          <w:rFonts w:eastAsia="Times New Roman" w:cs="Times New Roman"/>
+          <w:kern w:val="0"/>
+          <w:lang w:eastAsia="es-AR"/>
+          <w14:ligatures w14:val="none"/>
+        </w:rPr>
+        <w:t xml:space="preserve"> de R:</w:t>
+      </w:r>
+    </w:p>
+    <w:p>
+      <w:pPr>
+        <w:spacing w:before="120" w:after="120" w:line="240" w:lineRule="auto"/>
+        <w:rPr>
+          <w:rFonts w:ascii="Courier New" w:eastAsia="Times New Roman" w:hAnsi="Courier New" w:cs="Courier New"/>
+          <w:kern w:val="0"/>
+          <w:lang w:eastAsia="es-AR"/>
+          <w14:ligatures w14:val="none"/>
+        </w:rPr>
+      </w:pPr>
+      <w:proofErr w:type="spellStart"/>
+      <w:proofErr w:type="gramStart"/>
+      <w:r>
+        <w:rPr>
+          <w:rFonts w:ascii="Courier New" w:eastAsia="Times New Roman" w:hAnsi="Courier New" w:cs="Courier New"/>
+          <w:kern w:val="0"/>
+          <w:lang w:eastAsia="es-AR"/>
+          <w14:ligatures w14:val="none"/>
+        </w:rPr>
+        <w:lastRenderedPageBreak/>
+        <w:t>renv</w:t>
+      </w:r>
+      <w:proofErr w:type="spellEnd"/>
+      <w:r>
+        <w:rPr>
+          <w:rFonts w:ascii="Courier New" w:eastAsia="Times New Roman" w:hAnsi="Courier New" w:cs="Courier New"/>
+          <w:kern w:val="0"/>
+          <w:lang w:eastAsia="es-AR"/>
+          <w14:ligatures w14:val="none"/>
+        </w:rPr>
+        <w:t>::</w:t>
+      </w:r>
+      <w:proofErr w:type="spellStart"/>
+      <w:proofErr w:type="gramEnd"/>
+      <w:r>
+        <w:rPr>
+          <w:rFonts w:ascii="Courier New" w:eastAsia="Times New Roman" w:hAnsi="Courier New" w:cs="Courier New"/>
+          <w:kern w:val="0"/>
+          <w:lang w:eastAsia="es-AR"/>
+          <w14:ligatures w14:val="none"/>
+        </w:rPr>
+        <w:t>restore</w:t>
+      </w:r>
+      <w:proofErr w:type="spellEnd"/>
+      <w:r>
+        <w:rPr>
+          <w:rFonts w:ascii="Courier New" w:eastAsia="Times New Roman" w:hAnsi="Courier New" w:cs="Courier New"/>
+          <w:kern w:val="0"/>
+          <w:lang w:eastAsia="es-AR"/>
+          <w14:ligatures w14:val="none"/>
+        </w:rPr>
+        <w:t>()</w:t>
+      </w:r>
+    </w:p>
+    <w:p>
+      <w:pPr>
+        <w:spacing w:before="120" w:after="120" w:line="240" w:lineRule="auto"/>
+        <w:rPr>
+          <w:rFonts w:eastAsia="Times New Roman" w:cs="Times New Roman"/>
+          <w:kern w:val="0"/>
+          <w:lang w:eastAsia="es-AR"/>
+          <w14:ligatures w14:val="none"/>
+        </w:rPr>
+      </w:pPr>
+      <w:r>
+        <w:rPr>
+          <w:rFonts w:eastAsia="Times New Roman" w:cs="Times New Roman"/>
+          <w:kern w:val="0"/>
+          <w:lang w:eastAsia="es-AR"/>
+          <w14:ligatures w14:val="none"/>
+        </w:rPr>
+        <w:t xml:space="preserve">Esto asegura </w:t>
+      </w:r>
+      <w:proofErr w:type="gramStart"/>
+      <w:r>
+        <w:rPr>
+          <w:rFonts w:eastAsia="Times New Roman" w:cs="Times New Roman"/>
+          <w:kern w:val="0"/>
+          <w:lang w:eastAsia="es-AR"/>
+          <w14:ligatures w14:val="none"/>
+        </w:rPr>
+        <w:t>que</w:t>
+      </w:r>
+      <w:proofErr w:type="gramEnd"/>
+      <w:r>
+        <w:rPr>
+          <w:rFonts w:eastAsia="Times New Roman" w:cs="Times New Roman"/>
+          <w:kern w:val="0"/>
+          <w:lang w:eastAsia="es-AR"/>
+          <w14:ligatures w14:val="none"/>
+        </w:rPr>
+        <w:t xml:space="preserve"> si la "PC B" ahora usa una versión nueva de un paquete, la "PC A" también la instale de inmediato.</w:t>
+      </w:r>
+    </w:p>
+    <w:p>
+      <w:pPr>
+        <w:spacing w:before="120" w:after="120" w:line="240" w:lineRule="auto"/>
+        <w:rPr>
+          <w:rFonts w:eastAsia="Times New Roman" w:cs="Times New Roman"/>
+          <w:kern w:val="0"/>
+          <w:lang w:eastAsia="es-AR"/>
+          <w14:ligatures w14:val="none"/>
+        </w:rPr>
+      </w:pPr>
     </w:p>
     <w:sectPr>
       <w:pgSz w:w="11906" w:h="16838"/>
@@ -5341,7 +6094,7 @@
   <w:abstractNum w:abstractNumId="1" w15:restartNumberingAfterBreak="0">
     <w:nsid w:val="15715355"/>
     <w:multiLevelType w:val="multilevel"/>
-    <w:tmpl w:val="496AD818"/>
+    <w:tmpl w:val="942255F4"/>
     <w:lvl w:ilvl="0">
       <w:start w:val="1"/>
       <w:numFmt w:val="decimal"/>
@@ -5353,6 +6106,10 @@
         </w:tabs>
         <w:ind w:left="720" w:hanging="360"/>
       </w:pPr>
+      <w:rPr>
+        <w:b w:val="0"/>
+        <w:bCs w:val="0"/>
+      </w:rPr>
     </w:lvl>
     <w:lvl w:ilvl="1">
       <w:start w:val="1"/>
@@ -6131,7 +6888,7 @@
   <w:abstractNum w:abstractNumId="7" w15:restartNumberingAfterBreak="0">
     <w:nsid w:val="50BE3E03"/>
     <w:multiLevelType w:val="multilevel"/>
-    <w:tmpl w:val="8B2EFBF0"/>
+    <w:tmpl w:val="8402AF8C"/>
     <w:lvl w:ilvl="0">
       <w:start w:val="1"/>
       <w:numFmt w:val="decimal"/>
@@ -6143,6 +6900,10 @@
         </w:tabs>
         <w:ind w:left="720" w:hanging="360"/>
       </w:pPr>
+      <w:rPr>
+        <w:b/>
+        <w:bCs/>
+      </w:rPr>
     </w:lvl>
     <w:lvl w:ilvl="1" w:tentative="1">
       <w:start w:val="1"/>
@@ -6355,6 +7116,155 @@
     </w:lvl>
   </w:abstractNum>
   <w:abstractNum w:abstractNumId="9" w15:restartNumberingAfterBreak="0">
+    <w:nsid w:val="58C970AD"/>
+    <w:multiLevelType w:val="multilevel"/>
+    <w:tmpl w:val="D9A061AE"/>
+    <w:lvl w:ilvl="0">
+      <w:start w:val="1"/>
+      <w:numFmt w:val="bullet"/>
+      <w:lvlText w:val=""/>
+      <w:lvlJc w:val="left"/>
+      <w:pPr>
+        <w:tabs>
+          <w:tab w:val="num" w:pos="720"/>
+        </w:tabs>
+        <w:ind w:left="720" w:hanging="360"/>
+      </w:pPr>
+      <w:rPr>
+        <w:rFonts w:ascii="Symbol" w:hAnsi="Symbol" w:hint="default"/>
+        <w:sz w:val="20"/>
+      </w:rPr>
+    </w:lvl>
+    <w:lvl w:ilvl="1" w:tentative="1">
+      <w:start w:val="1"/>
+      <w:numFmt w:val="bullet"/>
+      <w:lvlText w:val="o"/>
+      <w:lvlJc w:val="left"/>
+      <w:pPr>
+        <w:tabs>
+          <w:tab w:val="num" w:pos="1440"/>
+        </w:tabs>
+        <w:ind w:left="1440" w:hanging="360"/>
+      </w:pPr>
+      <w:rPr>
+        <w:rFonts w:ascii="Courier New" w:hAnsi="Courier New" w:hint="default"/>
+        <w:sz w:val="20"/>
+      </w:rPr>
+    </w:lvl>
+    <w:lvl w:ilvl="2" w:tentative="1">
+      <w:start w:val="1"/>
+      <w:numFmt w:val="bullet"/>
+      <w:lvlText w:val=""/>
+      <w:lvlJc w:val="left"/>
+      <w:pPr>
+        <w:tabs>
+          <w:tab w:val="num" w:pos="2160"/>
+        </w:tabs>
+        <w:ind w:left="2160" w:hanging="360"/>
+      </w:pPr>
+      <w:rPr>
+        <w:rFonts w:ascii="Wingdings" w:hAnsi="Wingdings" w:hint="default"/>
+        <w:sz w:val="20"/>
+      </w:rPr>
+    </w:lvl>
+    <w:lvl w:ilvl="3" w:tentative="1">
+      <w:start w:val="1"/>
+      <w:numFmt w:val="bullet"/>
+      <w:lvlText w:val=""/>
+      <w:lvlJc w:val="left"/>
+      <w:pPr>
+        <w:tabs>
+          <w:tab w:val="num" w:pos="2880"/>
+        </w:tabs>
+        <w:ind w:left="2880" w:hanging="360"/>
+      </w:pPr>
+      <w:rPr>
+        <w:rFonts w:ascii="Wingdings" w:hAnsi="Wingdings" w:hint="default"/>
+        <w:sz w:val="20"/>
+      </w:rPr>
+    </w:lvl>
+    <w:lvl w:ilvl="4" w:tentative="1">
+      <w:start w:val="1"/>
+      <w:numFmt w:val="bullet"/>
+      <w:lvlText w:val=""/>
+      <w:lvlJc w:val="left"/>
+      <w:pPr>
+        <w:tabs>
+          <w:tab w:val="num" w:pos="3600"/>
+        </w:tabs>
+        <w:ind w:left="3600" w:hanging="360"/>
+      </w:pPr>
+      <w:rPr>
+        <w:rFonts w:ascii="Wingdings" w:hAnsi="Wingdings" w:hint="default"/>
+        <w:sz w:val="20"/>
+      </w:rPr>
+    </w:lvl>
+    <w:lvl w:ilvl="5" w:tentative="1">
+      <w:start w:val="1"/>
+      <w:numFmt w:val="bullet"/>
+      <w:lvlText w:val=""/>
+      <w:lvlJc w:val="left"/>
+      <w:pPr>
+        <w:tabs>
+          <w:tab w:val="num" w:pos="4320"/>
+        </w:tabs>
+        <w:ind w:left="4320" w:hanging="360"/>
+      </w:pPr>
+      <w:rPr>
+        <w:rFonts w:ascii="Wingdings" w:hAnsi="Wingdings" w:hint="default"/>
+        <w:sz w:val="20"/>
+      </w:rPr>
+    </w:lvl>
+    <w:lvl w:ilvl="6" w:tentative="1">
+      <w:start w:val="1"/>
+      <w:numFmt w:val="bullet"/>
+      <w:lvlText w:val=""/>
+      <w:lvlJc w:val="left"/>
+      <w:pPr>
+        <w:tabs>
+          <w:tab w:val="num" w:pos="5040"/>
+        </w:tabs>
+        <w:ind w:left="5040" w:hanging="360"/>
+      </w:pPr>
+      <w:rPr>
+        <w:rFonts w:ascii="Wingdings" w:hAnsi="Wingdings" w:hint="default"/>
+        <w:sz w:val="20"/>
+      </w:rPr>
+    </w:lvl>
+    <w:lvl w:ilvl="7" w:tentative="1">
+      <w:start w:val="1"/>
+      <w:numFmt w:val="bullet"/>
+      <w:lvlText w:val=""/>
+      <w:lvlJc w:val="left"/>
+      <w:pPr>
+        <w:tabs>
+          <w:tab w:val="num" w:pos="5760"/>
+        </w:tabs>
+        <w:ind w:left="5760" w:hanging="360"/>
+      </w:pPr>
+      <w:rPr>
+        <w:rFonts w:ascii="Wingdings" w:hAnsi="Wingdings" w:hint="default"/>
+        <w:sz w:val="20"/>
+      </w:rPr>
+    </w:lvl>
+    <w:lvl w:ilvl="8" w:tentative="1">
+      <w:start w:val="1"/>
+      <w:numFmt w:val="bullet"/>
+      <w:lvlText w:val=""/>
+      <w:lvlJc w:val="left"/>
+      <w:pPr>
+        <w:tabs>
+          <w:tab w:val="num" w:pos="6480"/>
+        </w:tabs>
+        <w:ind w:left="6480" w:hanging="360"/>
+      </w:pPr>
+      <w:rPr>
+        <w:rFonts w:ascii="Wingdings" w:hAnsi="Wingdings" w:hint="default"/>
+        <w:sz w:val="20"/>
+      </w:rPr>
+    </w:lvl>
+  </w:abstractNum>
+  <w:abstractNum w:abstractNumId="10" w15:restartNumberingAfterBreak="0">
     <w:nsid w:val="60EB521B"/>
     <w:multiLevelType w:val="multilevel"/>
     <w:tmpl w:val="3B36E708"/>
@@ -6503,7 +7413,7 @@
       </w:rPr>
     </w:lvl>
   </w:abstractNum>
-  <w:abstractNum w:abstractNumId="10" w15:restartNumberingAfterBreak="0">
+  <w:abstractNum w:abstractNumId="11" w15:restartNumberingAfterBreak="0">
     <w:nsid w:val="64973A3D"/>
     <w:multiLevelType w:val="multilevel"/>
     <w:tmpl w:val="DDEA061E"/>
@@ -6652,7 +7562,7 @@
       </w:rPr>
     </w:lvl>
   </w:abstractNum>
-  <w:abstractNum w:abstractNumId="11" w15:restartNumberingAfterBreak="0">
+  <w:abstractNum w:abstractNumId="12" w15:restartNumberingAfterBreak="0">
     <w:nsid w:val="6CBE79D2"/>
     <w:multiLevelType w:val="multilevel"/>
     <w:tmpl w:val="73642408"/>
@@ -6801,7 +7711,7 @@
       </w:rPr>
     </w:lvl>
   </w:abstractNum>
-  <w:abstractNum w:abstractNumId="12" w15:restartNumberingAfterBreak="0">
+  <w:abstractNum w:abstractNumId="13" w15:restartNumberingAfterBreak="0">
     <w:nsid w:val="771C4E48"/>
     <w:multiLevelType w:val="multilevel"/>
     <w:tmpl w:val="56BCC5D2"/>
@@ -6921,10 +7831,10 @@
     <w:abstractNumId w:val="0"/>
   </w:num>
   <w:num w:numId="2" w16cid:durableId="1575361143">
-    <w:abstractNumId w:val="12"/>
+    <w:abstractNumId w:val="13"/>
   </w:num>
   <w:num w:numId="3" w16cid:durableId="1501654277">
-    <w:abstractNumId w:val="11"/>
+    <w:abstractNumId w:val="12"/>
   </w:num>
   <w:num w:numId="4" w16cid:durableId="935867192">
     <w:abstractNumId w:val="5"/>
@@ -6945,16 +7855,19 @@
     <w:abstractNumId w:val="3"/>
   </w:num>
   <w:num w:numId="10" w16cid:durableId="81026074">
-    <w:abstractNumId w:val="10"/>
+    <w:abstractNumId w:val="11"/>
   </w:num>
   <w:num w:numId="11" w16cid:durableId="1676150511">
-    <w:abstractNumId w:val="9"/>
+    <w:abstractNumId w:val="10"/>
   </w:num>
   <w:num w:numId="12" w16cid:durableId="492378191">
     <w:abstractNumId w:val="4"/>
   </w:num>
   <w:num w:numId="13" w16cid:durableId="1191604787">
     <w:abstractNumId w:val="8"/>
+  </w:num>
+  <w:num w:numId="14" w16cid:durableId="1979996989">
+    <w:abstractNumId w:val="9"/>
   </w:num>
 </w:numbering>
 </file>

</xml_diff>

<commit_message>
Refactor: Organizar carpetas del proyecto y actualizar documentación
</commit_message>
<xml_diff>
--- a/Documentación - Proyecto HE_clas - Entorno virtual, instalación de librerias y github.docx
+++ b/Documentación - Proyecto HE_clas - Entorno virtual, instalación de librerias y github.docx
@@ -139,12 +139,21 @@
           <w:numId w:val="1"/>
         </w:numPr>
       </w:pPr>
-      <w:r>
-        <w:rPr>
-          <w:b/>
-          <w:bCs/>
-        </w:rPr>
-        <w:t>01_scripts/</w:t>
+      <w:proofErr w:type="spellStart"/>
+      <w:r>
+        <w:rPr>
+          <w:b/>
+          <w:bCs/>
+        </w:rPr>
+        <w:t>Analisis</w:t>
+      </w:r>
+      <w:proofErr w:type="spellEnd"/>
+      <w:r>
+        <w:rPr>
+          <w:b/>
+          <w:bCs/>
+        </w:rPr>
+        <w:t>/</w:t>
       </w:r>
       <w:r>
         <w:t xml:space="preserve">: Contiene los archivos de código (ej. </w:t>
@@ -175,7 +184,14 @@
           <w:b/>
           <w:bCs/>
         </w:rPr>
-        <w:t>02_data/</w:t>
+        <w:t>Datos</w:t>
+      </w:r>
+      <w:r>
+        <w:rPr>
+          <w:b/>
+          <w:bCs/>
+        </w:rPr>
+        <w:t>/</w:t>
       </w:r>
       <w:r>
         <w:t>: Contiene las bases de datos originales y procesadas (esta carpeta no se sube a internet).</w:t>
@@ -193,7 +209,14 @@
           <w:b/>
           <w:bCs/>
         </w:rPr>
-        <w:t>03_results/</w:t>
+        <w:t>Resultados</w:t>
+      </w:r>
+      <w:r>
+        <w:rPr>
+          <w:b/>
+          <w:bCs/>
+        </w:rPr>
+        <w:t>/</w:t>
       </w:r>
       <w:r>
         <w:t>: Contiene las tablas y gráficos generados por el código (tampoco se sube a internet).</w:t>
@@ -931,7 +954,7 @@
           <w:kern w:val="0"/>
           <w:sz w:val="24"/>
           <w:szCs w:val="24"/>
-          <w:lang w:eastAsia="es-AR"/>
+          <w:lang w:val="en-US" w:eastAsia="es-AR"/>
           <w14:ligatures w14:val="none"/>
         </w:rPr>
       </w:pPr>
@@ -1003,7 +1026,7 @@
           <w:kern w:val="0"/>
           <w:sz w:val="24"/>
           <w:szCs w:val="24"/>
-          <w:lang w:eastAsia="es-AR"/>
+          <w:lang w:val="en-US" w:eastAsia="es-AR"/>
           <w14:ligatures w14:val="none"/>
         </w:rPr>
       </w:pPr>
@@ -1015,7 +1038,7 @@
           <w:kern w:val="0"/>
           <w:sz w:val="24"/>
           <w:szCs w:val="24"/>
-          <w:lang w:eastAsia="es-AR"/>
+          <w:lang w:val="en-US" w:eastAsia="es-AR"/>
           <w14:ligatures w14:val="none"/>
         </w:rPr>
         <w:t>BiocManager</w:t>
@@ -1027,12 +1050,11 @@
           <w:kern w:val="0"/>
           <w:sz w:val="24"/>
           <w:szCs w:val="24"/>
-          <w:lang w:eastAsia="es-AR"/>
+          <w:lang w:val="en-US" w:eastAsia="es-AR"/>
           <w14:ligatures w14:val="none"/>
         </w:rPr>
         <w:t>::</w:t>
       </w:r>
-      <w:proofErr w:type="spellStart"/>
       <w:proofErr w:type="gramEnd"/>
       <w:r>
         <w:rPr>
@@ -1040,105 +1062,45 @@
           <w:kern w:val="0"/>
           <w:sz w:val="24"/>
           <w:szCs w:val="24"/>
-          <w:lang w:eastAsia="es-AR"/>
-          <w14:ligatures w14:val="none"/>
-        </w:rPr>
-        <w:t>install</w:t>
-      </w:r>
-      <w:proofErr w:type="spellEnd"/>
+          <w:lang w:val="en-US" w:eastAsia="es-AR"/>
+          <w14:ligatures w14:val="none"/>
+        </w:rPr>
+        <w:t>install("</w:t>
+      </w:r>
+      <w:proofErr w:type="spellStart"/>
       <w:r>
         <w:rPr>
           <w:rFonts w:ascii="Times New Roman" w:eastAsia="Times New Roman" w:hAnsi="Times New Roman" w:cs="Times New Roman"/>
           <w:kern w:val="0"/>
           <w:sz w:val="24"/>
           <w:szCs w:val="24"/>
-          <w:lang w:eastAsia="es-AR"/>
-          <w14:ligatures w14:val="none"/>
-        </w:rPr>
-        <w:t>("</w:t>
-      </w:r>
-      <w:proofErr w:type="spellStart"/>
+          <w:lang w:val="en-US" w:eastAsia="es-AR"/>
+          <w14:ligatures w14:val="none"/>
+        </w:rPr>
+        <w:t>EnhancedVolcano</w:t>
+      </w:r>
+      <w:proofErr w:type="spellEnd"/>
       <w:r>
         <w:rPr>
           <w:rFonts w:ascii="Times New Roman" w:eastAsia="Times New Roman" w:hAnsi="Times New Roman" w:cs="Times New Roman"/>
           <w:kern w:val="0"/>
           <w:sz w:val="24"/>
           <w:szCs w:val="24"/>
-          <w:lang w:eastAsia="es-AR"/>
-          <w14:ligatures w14:val="none"/>
-        </w:rPr>
-        <w:t>EnhancedVolcano</w:t>
-      </w:r>
-      <w:proofErr w:type="spellEnd"/>
-      <w:r>
+          <w:lang w:val="en-US" w:eastAsia="es-AR"/>
+          <w14:ligatures w14:val="none"/>
+        </w:rPr>
+        <w:t>", update = FALSE, ask = FALSE)</w:t>
+      </w:r>
+    </w:p>
+    <w:p>
+      <w:pPr>
+        <w:spacing w:before="100" w:beforeAutospacing="1" w:after="100" w:afterAutospacing="1" w:line="240" w:lineRule="auto"/>
         <w:rPr>
           <w:rFonts w:ascii="Times New Roman" w:eastAsia="Times New Roman" w:hAnsi="Times New Roman" w:cs="Times New Roman"/>
           <w:kern w:val="0"/>
           <w:sz w:val="24"/>
           <w:szCs w:val="24"/>
-          <w:lang w:eastAsia="es-AR"/>
-          <w14:ligatures w14:val="none"/>
-        </w:rPr>
-        <w:t xml:space="preserve">", </w:t>
-      </w:r>
-      <w:proofErr w:type="spellStart"/>
-      <w:r>
-        <w:rPr>
-          <w:rFonts w:ascii="Times New Roman" w:eastAsia="Times New Roman" w:hAnsi="Times New Roman" w:cs="Times New Roman"/>
-          <w:kern w:val="0"/>
-          <w:sz w:val="24"/>
-          <w:szCs w:val="24"/>
-          <w:lang w:eastAsia="es-AR"/>
-          <w14:ligatures w14:val="none"/>
-        </w:rPr>
-        <w:t>update</w:t>
-      </w:r>
-      <w:proofErr w:type="spellEnd"/>
-      <w:r>
-        <w:rPr>
-          <w:rFonts w:ascii="Times New Roman" w:eastAsia="Times New Roman" w:hAnsi="Times New Roman" w:cs="Times New Roman"/>
-          <w:kern w:val="0"/>
-          <w:sz w:val="24"/>
-          <w:szCs w:val="24"/>
-          <w:lang w:eastAsia="es-AR"/>
-          <w14:ligatures w14:val="none"/>
-        </w:rPr>
-        <w:t xml:space="preserve"> = FALSE, </w:t>
-      </w:r>
-      <w:proofErr w:type="spellStart"/>
-      <w:r>
-        <w:rPr>
-          <w:rFonts w:ascii="Times New Roman" w:eastAsia="Times New Roman" w:hAnsi="Times New Roman" w:cs="Times New Roman"/>
-          <w:kern w:val="0"/>
-          <w:sz w:val="24"/>
-          <w:szCs w:val="24"/>
-          <w:lang w:eastAsia="es-AR"/>
-          <w14:ligatures w14:val="none"/>
-        </w:rPr>
-        <w:t>ask</w:t>
-      </w:r>
-      <w:proofErr w:type="spellEnd"/>
-      <w:r>
-        <w:rPr>
-          <w:rFonts w:ascii="Times New Roman" w:eastAsia="Times New Roman" w:hAnsi="Times New Roman" w:cs="Times New Roman"/>
-          <w:kern w:val="0"/>
-          <w:sz w:val="24"/>
-          <w:szCs w:val="24"/>
-          <w:lang w:eastAsia="es-AR"/>
-          <w14:ligatures w14:val="none"/>
-        </w:rPr>
-        <w:t xml:space="preserve"> = FALSE)</w:t>
-      </w:r>
-    </w:p>
-    <w:p>
-      <w:pPr>
-        <w:spacing w:before="100" w:beforeAutospacing="1" w:after="100" w:afterAutospacing="1" w:line="240" w:lineRule="auto"/>
-        <w:rPr>
-          <w:rFonts w:ascii="Times New Roman" w:eastAsia="Times New Roman" w:hAnsi="Times New Roman" w:cs="Times New Roman"/>
-          <w:kern w:val="0"/>
-          <w:sz w:val="24"/>
-          <w:szCs w:val="24"/>
-          <w:lang w:eastAsia="es-AR"/>
+          <w:lang w:val="en-US" w:eastAsia="es-AR"/>
           <w14:ligatures w14:val="none"/>
         </w:rPr>
       </w:pPr>
@@ -2723,7 +2685,6 @@
         </w:rPr>
         <w:t xml:space="preserve"> </w:t>
       </w:r>
-      <w:proofErr w:type="spellStart"/>
       <w:proofErr w:type="gramStart"/>
       <w:r>
         <w:rPr>
@@ -2732,17 +2693,7 @@
           <w:lang w:eastAsia="es-AR"/>
           <w14:ligatures w14:val="none"/>
         </w:rPr>
-        <w:t>add</w:t>
-      </w:r>
-      <w:proofErr w:type="spellEnd"/>
-      <w:r>
-        <w:rPr>
-          <w:rFonts w:ascii="Courier New" w:eastAsia="Times New Roman" w:hAnsi="Courier New" w:cs="Courier New"/>
-          <w:kern w:val="0"/>
-          <w:lang w:eastAsia="es-AR"/>
-          <w14:ligatures w14:val="none"/>
-        </w:rPr>
-        <w:t xml:space="preserve"> .</w:t>
+        <w:t>add .</w:t>
       </w:r>
       <w:proofErr w:type="gramEnd"/>
       <w:r>
@@ -3113,25 +3064,7 @@
           <w:lang w:eastAsia="es-AR"/>
           <w14:ligatures w14:val="none"/>
         </w:rPr>
-        <w:t xml:space="preserve"> https://github.com/</w:t>
-      </w:r>
-      <w:r>
-        <w:rPr>
-          <w:rFonts w:ascii="Courier New" w:eastAsia="Times New Roman" w:hAnsi="Courier New" w:cs="Courier New"/>
-          <w:kern w:val="0"/>
-          <w:lang w:eastAsia="es-AR"/>
-          <w14:ligatures w14:val="none"/>
-        </w:rPr>
-        <w:t>mjgermano90</w:t>
-      </w:r>
-      <w:r>
-        <w:rPr>
-          <w:rFonts w:ascii="Courier New" w:eastAsia="Times New Roman" w:hAnsi="Courier New" w:cs="Courier New"/>
-          <w:kern w:val="0"/>
-          <w:lang w:eastAsia="es-AR"/>
-          <w14:ligatures w14:val="none"/>
-        </w:rPr>
-        <w:t>/HE_clas.git</w:t>
+        <w:t xml:space="preserve"> https://github.com/mjgermano90/HE_clas.git</w:t>
       </w:r>
       <w:r>
         <w:rPr>
@@ -3605,16 +3538,7 @@
           <w:lang w:eastAsia="es-AR"/>
           <w14:ligatures w14:val="none"/>
         </w:rPr>
-        <w:t>https://github.com/</w:t>
-      </w:r>
-      <w:r>
-        <w:rPr>
-          <w:rFonts w:ascii="Courier New" w:eastAsia="Times New Roman" w:hAnsi="Courier New" w:cs="Courier New"/>
-          <w:kern w:val="0"/>
-          <w:lang w:eastAsia="es-AR"/>
-          <w14:ligatures w14:val="none"/>
-        </w:rPr>
-        <w:t xml:space="preserve"> </w:t>
+        <w:t xml:space="preserve">https://github.com/ </w:t>
       </w:r>
       <w:r>
         <w:rPr>
@@ -3857,16 +3781,7 @@
           <w:lang w:eastAsia="es-AR"/>
           <w14:ligatures w14:val="none"/>
         </w:rPr>
-        <w:t>, ejecutar</w:t>
-      </w:r>
-      <w:r>
-        <w:rPr>
-          <w:rFonts w:eastAsia="Times New Roman" w:cs="Times New Roman"/>
-          <w:kern w:val="0"/>
-          <w:lang w:eastAsia="es-AR"/>
-          <w14:ligatures w14:val="none"/>
-        </w:rPr>
-        <w:t>:</w:t>
+        <w:t>, ejecutar:</w:t>
       </w:r>
     </w:p>
     <w:p>
@@ -8474,6 +8389,7 @@
   <w:style w:type="character" w:default="1" w:styleId="Fuentedeprrafopredeter">
     <w:name w:val="Default Paragraph Font"/>
     <w:uiPriority w:val="1"/>
+    <w:semiHidden/>
     <w:unhideWhenUsed/>
   </w:style>
   <w:style w:type="table" w:default="1" w:styleId="Tablanormal">

</xml_diff>